<commit_message>
Added fixed all errors about to do final review and submit maini error fixed in enquiry,sructured form better
</commit_message>
<xml_diff>
--- a/Doccuments/Proposal 1.docx
+++ b/Doccuments/Proposal 1.docx
@@ -9,7 +9,7 @@
           <w:rFonts w:ascii="Aptos" w:hAnsi="Aptos"/>
           <w:b/>
           <w:bCs/>
-          <w:color w:val="1F497D" w:themeColor="text2"/>
+          <w:color w:val="4F6228" w:themeColor="accent3" w:themeShade="80"/>
           <w:sz w:val="96"/>
           <w:szCs w:val="96"/>
           <w:lang w:val="en-US"/>
@@ -20,7 +20,7 @@
           <w:rFonts w:ascii="Aptos" w:hAnsi="Aptos"/>
           <w:b/>
           <w:bCs/>
-          <w:color w:val="1F497D" w:themeColor="text2"/>
+          <w:color w:val="4F6228" w:themeColor="accent3" w:themeShade="80"/>
           <w:sz w:val="96"/>
           <w:szCs w:val="96"/>
           <w:lang w:val="en-US"/>
@@ -35,7 +35,7 @@
           <w:rFonts w:ascii="Aptos" w:hAnsi="Aptos"/>
           <w:b/>
           <w:bCs/>
-          <w:color w:val="1F497D" w:themeColor="text2"/>
+          <w:color w:val="4F6228" w:themeColor="accent3" w:themeShade="80"/>
           <w:sz w:val="96"/>
           <w:szCs w:val="96"/>
           <w:lang w:val="en-US"/>
@@ -46,7 +46,7 @@
           <w:rFonts w:ascii="Aptos" w:hAnsi="Aptos"/>
           <w:b/>
           <w:bCs/>
-          <w:color w:val="1F497D" w:themeColor="text2"/>
+          <w:color w:val="4F6228" w:themeColor="accent3" w:themeShade="80"/>
           <w:sz w:val="96"/>
           <w:szCs w:val="96"/>
           <w:lang w:val="en-US"/>
@@ -61,7 +61,7 @@
           <w:rFonts w:ascii="Aptos" w:hAnsi="Aptos"/>
           <w:b/>
           <w:bCs/>
-          <w:color w:val="1F497D" w:themeColor="text2"/>
+          <w:color w:val="4F6228" w:themeColor="accent3" w:themeShade="80"/>
           <w:sz w:val="96"/>
           <w:szCs w:val="96"/>
           <w:lang w:val="en-US"/>
@@ -72,7 +72,7 @@
           <w:rFonts w:ascii="Aptos" w:hAnsi="Aptos"/>
           <w:b/>
           <w:bCs/>
-          <w:color w:val="1F497D" w:themeColor="text2"/>
+          <w:color w:val="4F6228" w:themeColor="accent3" w:themeShade="80"/>
           <w:sz w:val="96"/>
           <w:szCs w:val="96"/>
           <w:lang w:val="en-US"/>
@@ -87,7 +87,7 @@
           <w:rFonts w:ascii="Aptos" w:hAnsi="Aptos"/>
           <w:b/>
           <w:bCs/>
-          <w:color w:val="1F497D" w:themeColor="text2"/>
+          <w:color w:val="4F6228" w:themeColor="accent3" w:themeShade="80"/>
           <w:sz w:val="96"/>
           <w:szCs w:val="96"/>
           <w:lang w:val="en-US"/>
@@ -98,7 +98,7 @@
           <w:rFonts w:ascii="Aptos" w:hAnsi="Aptos"/>
           <w:b/>
           <w:bCs/>
-          <w:color w:val="1F497D" w:themeColor="text2"/>
+          <w:color w:val="4F6228" w:themeColor="accent3" w:themeShade="80"/>
           <w:sz w:val="96"/>
           <w:szCs w:val="96"/>
           <w:lang w:val="en-US"/>
@@ -113,7 +113,7 @@
           <w:rFonts w:ascii="Aptos" w:hAnsi="Aptos"/>
           <w:b/>
           <w:bCs/>
-          <w:color w:val="1F497D" w:themeColor="text2"/>
+          <w:color w:val="4F6228" w:themeColor="accent3" w:themeShade="80"/>
           <w:sz w:val="96"/>
           <w:szCs w:val="96"/>
           <w:lang w:val="en-US"/>
@@ -124,7 +124,7 @@
           <w:rFonts w:ascii="Aptos" w:hAnsi="Aptos"/>
           <w:b/>
           <w:bCs/>
-          <w:color w:val="1F497D" w:themeColor="text2"/>
+          <w:color w:val="4F6228" w:themeColor="accent3" w:themeShade="80"/>
           <w:sz w:val="96"/>
           <w:szCs w:val="96"/>
           <w:lang w:val="en-US"/>
@@ -139,7 +139,7 @@
           <w:rFonts w:ascii="Aptos" w:hAnsi="Aptos"/>
           <w:b/>
           <w:bCs/>
-          <w:color w:val="1F497D" w:themeColor="text2"/>
+          <w:color w:val="4F6228" w:themeColor="accent3" w:themeShade="80"/>
           <w:sz w:val="96"/>
           <w:szCs w:val="96"/>
           <w:lang w:val="en-US"/>
@@ -150,7 +150,7 @@
           <w:rFonts w:ascii="Aptos" w:hAnsi="Aptos"/>
           <w:b/>
           <w:bCs/>
-          <w:color w:val="1F497D" w:themeColor="text2"/>
+          <w:color w:val="4F6228" w:themeColor="accent3" w:themeShade="80"/>
           <w:sz w:val="96"/>
           <w:szCs w:val="96"/>
           <w:lang w:val="en-US"/>
@@ -165,6 +165,7 @@
           <w:rFonts w:ascii="Aptos" w:hAnsi="Aptos"/>
           <w:b/>
           <w:bCs/>
+          <w:color w:val="4F6228" w:themeColor="accent3" w:themeShade="80"/>
           <w:sz w:val="96"/>
           <w:szCs w:val="96"/>
           <w:lang w:val="en-US"/>
@@ -175,7 +176,7 @@
           <w:rFonts w:ascii="Aptos" w:hAnsi="Aptos"/>
           <w:b/>
           <w:bCs/>
-          <w:color w:val="1F497D" w:themeColor="text2"/>
+          <w:color w:val="4F6228" w:themeColor="accent3" w:themeShade="80"/>
           <w:sz w:val="96"/>
           <w:szCs w:val="96"/>
           <w:lang w:val="en-US"/>
@@ -1028,10 +1029,10 @@
           <w:pgSz w:w="12240" w:h="15840"/>
           <w:pgMar w:top="1440" w:right="1440" w:bottom="1440" w:left="1440" w:header="720" w:footer="720" w:gutter="0"/>
           <w:pgBorders w:display="firstPage" w:offsetFrom="page">
-            <w:top w:val="single" w:sz="36" w:space="24" w:color="1F497D" w:themeColor="text2" w:shadow="1"/>
-            <w:left w:val="single" w:sz="36" w:space="24" w:color="1F497D" w:themeColor="text2" w:shadow="1"/>
-            <w:bottom w:val="single" w:sz="36" w:space="24" w:color="1F497D" w:themeColor="text2" w:shadow="1"/>
-            <w:right w:val="single" w:sz="36" w:space="24" w:color="1F497D" w:themeColor="text2" w:shadow="1"/>
+            <w:top w:val="single" w:sz="36" w:space="24" w:color="4F6228" w:themeColor="accent3" w:themeShade="80" w:shadow="1"/>
+            <w:left w:val="single" w:sz="36" w:space="24" w:color="4F6228" w:themeColor="accent3" w:themeShade="80" w:shadow="1"/>
+            <w:bottom w:val="single" w:sz="36" w:space="24" w:color="4F6228" w:themeColor="accent3" w:themeShade="80" w:shadow="1"/>
+            <w:right w:val="single" w:sz="36" w:space="24" w:color="4F6228" w:themeColor="accent3" w:themeShade="80" w:shadow="1"/>
           </w:pgBorders>
           <w:cols w:space="720"/>
           <w:docGrid w:linePitch="360"/>
@@ -1266,7 +1267,19 @@
         <w:rPr>
           <w:rFonts w:ascii="Aptos" w:hAnsi="Aptos"/>
         </w:rPr>
-        <w:t xml:space="preserve">The website will be developed using HTML and CSS </w:t>
+        <w:t>The website will be developed using HTML and CSS</w:t>
+      </w:r>
+      <w:r>
+        <w:rPr>
+          <w:rFonts w:ascii="Aptos" w:hAnsi="Aptos"/>
+        </w:rPr>
+        <w:t>,</w:t>
+      </w:r>
+      <w:r>
+        <w:rPr>
+          <w:rFonts w:ascii="Aptos" w:hAnsi="Aptos"/>
+        </w:rPr>
+        <w:t xml:space="preserve"> </w:t>
       </w:r>
       <w:r>
         <w:rPr>
@@ -3310,19 +3323,7 @@
         <w:rPr>
           <w:rFonts w:ascii="Aptos" w:hAnsi="Aptos"/>
         </w:rPr>
-        <w:t xml:space="preserve">iStock (2024) </w:t>
-      </w:r>
-      <w:r>
-        <w:rPr>
-          <w:rFonts w:ascii="Aptos" w:hAnsi="Aptos"/>
-        </w:rPr>
-        <w:t>Contemporary Garden</w:t>
-      </w:r>
-      <w:r>
-        <w:rPr>
-          <w:rFonts w:ascii="Aptos" w:hAnsi="Aptos"/>
-        </w:rPr>
-        <w:t xml:space="preserve"> stock photos. Available at: </w:t>
+        <w:t xml:space="preserve">iStock (2024) Contemporary Garden stock photos. Available at: </w:t>
       </w:r>
       <w:hyperlink r:id="rId13" w:tgtFrame="_new" w:history="1">
         <w:r>
@@ -3330,21 +3331,7 @@
             <w:rStyle w:val="Hyperlink"/>
             <w:rFonts w:ascii="Aptos" w:hAnsi="Aptos"/>
           </w:rPr>
-          <w:t>http</w:t>
-        </w:r>
-        <w:r>
-          <w:rPr>
-            <w:rStyle w:val="Hyperlink"/>
-            <w:rFonts w:ascii="Aptos" w:hAnsi="Aptos"/>
-          </w:rPr>
-          <w:t>s</w:t>
-        </w:r>
-        <w:r>
-          <w:rPr>
-            <w:rStyle w:val="Hyperlink"/>
-            <w:rFonts w:ascii="Aptos" w:hAnsi="Aptos"/>
-          </w:rPr>
-          <w:t>://share.google/i8Y8NMgpv9WIIbO5e</w:t>
+          <w:t>https://share.google/i8Y8NMgpv9WIIbO5e</w:t>
         </w:r>
       </w:hyperlink>
       <w:r>
@@ -3365,19 +3352,7 @@
         <w:rPr>
           <w:rFonts w:ascii="Aptos" w:hAnsi="Aptos"/>
         </w:rPr>
-        <w:t>OpenAI (2024) Charles Greenway Gardening Logo [Image]. Created using DALL·E.</w:t>
-      </w:r>
-      <w:r>
-        <w:rPr>
-          <w:rFonts w:ascii="Aptos" w:hAnsi="Aptos"/>
-        </w:rPr>
-        <w:t xml:space="preserve"> </w:t>
-      </w:r>
-      <w:r>
-        <w:rPr>
-          <w:rFonts w:ascii="Aptos" w:hAnsi="Aptos"/>
-        </w:rPr>
-        <w:t>(Accessed: 18 April 2026).</w:t>
+        <w:t>OpenAI (2024) Charles Greenway Gardening Logo [Image]. Created using DALL·E. (Accessed: 18 April 2026).</w:t>
       </w:r>
       <w:r>
         <w:rPr>
@@ -3428,9 +3403,9 @@
           <w:lang w:val="en-US"/>
         </w:rPr>
         <w:drawing>
-          <wp:inline distT="0" distB="0" distL="0" distR="0" wp14:anchorId="27D5B17A" wp14:editId="6B85AD6A">
+          <wp:inline distT="0" distB="0" distL="0" distR="0" wp14:anchorId="27D5B17A" wp14:editId="0E869C74">
             <wp:extent cx="5943600" cy="6699983"/>
-            <wp:effectExtent l="0" t="76200" r="0" b="0"/>
+            <wp:effectExtent l="0" t="95250" r="0" b="0"/>
             <wp:docPr id="617722552" name="Diagram 2"/>
             <wp:cNvGraphicFramePr/>
             <a:graphic xmlns:a="http://schemas.openxmlformats.org/drawingml/2006/main">
@@ -3441,6 +3416,46 @@
           </wp:inline>
         </w:drawing>
       </w:r>
+    </w:p>
+    <w:p>
+      <w:pPr>
+        <w:rPr>
+          <w:lang w:val="en-US"/>
+        </w:rPr>
+      </w:pPr>
+      <w:r>
+        <w:rPr>
+          <w:lang w:val="en-US"/>
+        </w:rPr>
+        <w:br w:type="page"/>
+      </w:r>
+    </w:p>
+    <w:p>
+      <w:pPr>
+        <w:pStyle w:val="Heading1"/>
+      </w:pPr>
+      <w:r>
+        <w:lastRenderedPageBreak/>
+        <w:t>GitHub Link:</w:t>
+      </w:r>
+      <w:r>
+        <w:t xml:space="preserve"> </w:t>
+      </w:r>
+      <w:hyperlink r:id="rId19" w:history="1">
+        <w:r>
+          <w:rPr>
+            <w:rStyle w:val="Hyperlink"/>
+          </w:rPr>
+          <w:t>https://github.com/imo100/Part-1.git</w:t>
+        </w:r>
+      </w:hyperlink>
+    </w:p>
+    <w:p>
+      <w:pPr>
+        <w:rPr>
+          <w:lang w:val="en-US"/>
+        </w:rPr>
+      </w:pPr>
     </w:p>
     <w:sectPr>
       <w:type w:val="continuous"/>
@@ -4351,6 +4366,7 @@
   <w:style w:type="character" w:default="1" w:styleId="DefaultParagraphFont">
     <w:name w:val="Default Paragraph Font"/>
     <w:uiPriority w:val="1"/>
+    <w:semiHidden/>
     <w:unhideWhenUsed/>
   </w:style>
   <w:style w:type="table" w:default="1" w:styleId="TableNormal">
@@ -6586,11 +6602,11 @@
       <dgm:prSet phldrT="[Text]" custT="1"/>
       <dgm:spPr/>
       <dgm:t>
-        <a:bodyPr/>
+        <a:bodyPr vert="vert"/>
         <a:lstStyle/>
         <a:p>
           <a:r>
-            <a:rPr lang="en-ZA" sz="1400" b="1">
+            <a:rPr lang="en-ZA" sz="1400" b="1" u="sng">
               <a:latin typeface="Aptos" panose="020B0004020202020204" pitchFamily="34" charset="0"/>
             </a:rPr>
             <a:t>Home</a:t>
@@ -6601,7 +6617,47 @@
             <a:rPr lang="en-ZA" sz="1100">
               <a:latin typeface="Aptos" panose="020B0004020202020204" pitchFamily="34" charset="0"/>
             </a:rPr>
-            <a:t>(Intro)</a:t>
+            <a:t>Header/</a:t>
+          </a:r>
+        </a:p>
+        <a:p>
+          <a:r>
+            <a:rPr lang="en-ZA" sz="1100">
+              <a:latin typeface="Aptos" panose="020B0004020202020204" pitchFamily="34" charset="0"/>
+            </a:rPr>
+            <a:t>Navigation Menue</a:t>
+          </a:r>
+        </a:p>
+        <a:p>
+          <a:r>
+            <a:rPr lang="en-ZA" sz="1100">
+              <a:latin typeface="Aptos" panose="020B0004020202020204" pitchFamily="34" charset="0"/>
+            </a:rPr>
+            <a:t>Intro</a:t>
+          </a:r>
+        </a:p>
+        <a:p>
+          <a:r>
+            <a:rPr lang="en-ZA" sz="1100">
+              <a:latin typeface="Aptos" panose="020B0004020202020204" pitchFamily="34" charset="0"/>
+            </a:rPr>
+            <a:t>Hero Image</a:t>
+          </a:r>
+        </a:p>
+        <a:p>
+          <a:r>
+            <a:rPr lang="en-ZA" sz="1100">
+              <a:latin typeface="Aptos" panose="020B0004020202020204" pitchFamily="34" charset="0"/>
+            </a:rPr>
+            <a:t>Call To Action</a:t>
+          </a:r>
+        </a:p>
+        <a:p>
+          <a:r>
+            <a:rPr lang="en-ZA" sz="1100">
+              <a:latin typeface="Aptos" panose="020B0004020202020204" pitchFamily="34" charset="0"/>
+            </a:rPr>
+            <a:t>Footer</a:t>
           </a:r>
         </a:p>
       </dgm:t>
@@ -6636,7 +6692,7 @@
         <a:lstStyle/>
         <a:p>
           <a:r>
-            <a:rPr lang="en-ZA" sz="1400" b="1">
+            <a:rPr lang="en-ZA" sz="1400" b="1" u="sng">
               <a:latin typeface="Aptos" panose="020B0004020202020204" pitchFamily="34" charset="0"/>
             </a:rPr>
             <a:t>Enquiry</a:t>
@@ -6647,15 +6703,7 @@
             <a:rPr lang="en-ZA" sz="1200">
               <a:latin typeface="Aptos" panose="020B0004020202020204" pitchFamily="34" charset="0"/>
             </a:rPr>
-            <a:t>Form</a:t>
-          </a:r>
-        </a:p>
-        <a:p>
-          <a:r>
-            <a:rPr lang="en-ZA" sz="1200">
-              <a:latin typeface="Aptos" panose="020B0004020202020204" pitchFamily="34" charset="0"/>
-            </a:rPr>
-            <a:t>Based on what clients need</a:t>
+            <a:t>Form for product/service enquines</a:t>
           </a:r>
         </a:p>
       </dgm:t>
@@ -6690,12 +6738,12 @@
         <a:lstStyle/>
         <a:p>
           <a:r>
-            <a:rPr lang="en-ZA" sz="1400" b="1">
+            <a:rPr lang="en-ZA" sz="1400" b="1" u="sng">
               <a:latin typeface="Aptos" panose="020B0004020202020204" pitchFamily="34" charset="0"/>
             </a:rPr>
             <a:t>Contact</a:t>
           </a:r>
-          <a:endParaRPr lang="en-ZA" sz="1100" b="0">
+          <a:endParaRPr lang="en-ZA" sz="1100" b="0" u="sng">
             <a:latin typeface="Aptos" panose="020B0004020202020204" pitchFamily="34" charset="0"/>
           </a:endParaRPr>
         </a:p>
@@ -6704,7 +6752,7 @@
             <a:rPr lang="en-ZA" sz="1200" b="0">
               <a:latin typeface="Aptos" panose="020B0004020202020204" pitchFamily="34" charset="0"/>
             </a:rPr>
-            <a:t>Buissnes Detail</a:t>
+            <a:t>Contact information, map</a:t>
           </a:r>
         </a:p>
       </dgm:t>
@@ -6739,26 +6787,21 @@
         <a:lstStyle/>
         <a:p>
           <a:r>
-            <a:rPr lang="en-ZA" sz="1400" b="1"/>
+            <a:rPr lang="en-ZA" sz="1400" b="1" u="sng"/>
             <a:t>About</a:t>
           </a:r>
         </a:p>
         <a:p>
           <a:r>
-            <a:rPr lang="en-ZA" sz="1200" b="0"/>
-            <a:t>Our story</a:t>
+            <a:rPr lang="en-ZA" sz="1200" b="0" u="none">
+              <a:latin typeface="Aptos" panose="020B0004020202020204" pitchFamily="34" charset="0"/>
+            </a:rPr>
+            <a:t>,Organisation's history, mission, vision, team members and footer</a:t>
           </a:r>
-        </a:p>
-        <a:p>
           <a:r>
-            <a:rPr lang="en-ZA" sz="1200" b="0"/>
-            <a:t>The team</a:t>
-          </a:r>
-        </a:p>
-        <a:p>
-          <a:r>
-            <a:rPr lang="en-ZA" sz="1200" b="0"/>
-            <a:t>reviews</a:t>
+            <a:rPr lang="en-ZA" sz="1400" b="1" u="sng"/>
+            <a:t>
+</a:t>
           </a:r>
         </a:p>
       </dgm:t>
@@ -6793,7 +6836,7 @@
         <a:lstStyle/>
         <a:p>
           <a:r>
-            <a:rPr lang="en-ZA" sz="1400" b="1">
+            <a:rPr lang="en-ZA" sz="1400" b="1" u="sng">
               <a:latin typeface="Aptos" panose="020B0004020202020204" pitchFamily="34" charset="0"/>
             </a:rPr>
             <a:t>Services</a:t>
@@ -6804,15 +6847,7 @@
             <a:rPr lang="en-ZA" sz="1200">
               <a:latin typeface="Aptos" panose="020B0004020202020204" pitchFamily="34" charset="0"/>
             </a:rPr>
-            <a:t>Offers </a:t>
-          </a:r>
-        </a:p>
-        <a:p>
-          <a:r>
-            <a:rPr lang="en-ZA" sz="1200">
-              <a:latin typeface="Aptos" panose="020B0004020202020204" pitchFamily="34" charset="0"/>
-            </a:rPr>
-            <a:t> Pricing</a:t>
+            <a:t>Offers and Pricing</a:t>
           </a:r>
         </a:p>
       </dgm:t>
@@ -6856,7 +6891,7 @@
       <dgm:spPr/>
     </dgm:pt>
     <dgm:pt modelId="{F9761A3D-BD27-4661-BFA2-D015331A3776}" type="pres">
-      <dgm:prSet presAssocID="{B4C21EB2-0897-49B5-BF95-50FF8E2D9A73}" presName="LevelOneTextNode" presStyleLbl="node0" presStyleIdx="0" presStyleCnt="1">
+      <dgm:prSet presAssocID="{B4C21EB2-0897-49B5-BF95-50FF8E2D9A73}" presName="LevelOneTextNode" presStyleLbl="node0" presStyleIdx="0" presStyleCnt="1" custLinFactNeighborX="-10960" custLinFactNeighborY="-278">
         <dgm:presLayoutVars>
           <dgm:chPref val="3"/>
         </dgm:presLayoutVars>
@@ -7033,8 +7068,8 @@
       </dsp:nvSpPr>
       <dsp:spPr>
         <a:xfrm>
-          <a:off x="1205238" y="3349991"/>
-          <a:ext cx="789417" cy="2256337"/>
+          <a:off x="1203379" y="3332384"/>
+          <a:ext cx="791275" cy="2273944"/>
         </a:xfrm>
         <a:custGeom>
           <a:avLst/>
@@ -7048,13 +7083,13 @@
                 <a:pt x="0" y="0"/>
               </a:moveTo>
               <a:lnTo>
-                <a:pt x="394708" y="0"/>
+                <a:pt x="395637" y="0"/>
               </a:lnTo>
               <a:lnTo>
-                <a:pt x="394708" y="2256337"/>
+                <a:pt x="395637" y="2273944"/>
               </a:lnTo>
               <a:lnTo>
-                <a:pt x="789417" y="2256337"/>
+                <a:pt x="791275" y="2273944"/>
               </a:lnTo>
             </a:path>
           </a:pathLst>
@@ -7109,8 +7144,8 @@
         </a:p>
       </dsp:txBody>
       <dsp:txXfrm>
-        <a:off x="1540185" y="4418398"/>
-        <a:ext cx="119522" cy="119522"/>
+        <a:off x="1538825" y="4409164"/>
+        <a:ext cx="120384" cy="120384"/>
       </dsp:txXfrm>
     </dsp:sp>
     <dsp:sp modelId="{521EE06D-D8B0-4D69-B156-29CF798404FF}">
@@ -7120,8 +7155,8 @@
       </dsp:nvSpPr>
       <dsp:spPr>
         <a:xfrm>
-          <a:off x="1205238" y="3349991"/>
-          <a:ext cx="789417" cy="752112"/>
+          <a:off x="1203379" y="3332384"/>
+          <a:ext cx="791275" cy="769719"/>
         </a:xfrm>
         <a:custGeom>
           <a:avLst/>
@@ -7135,13 +7170,13 @@
                 <a:pt x="0" y="0"/>
               </a:moveTo>
               <a:lnTo>
-                <a:pt x="394708" y="0"/>
+                <a:pt x="395637" y="0"/>
               </a:lnTo>
               <a:lnTo>
-                <a:pt x="394708" y="752112"/>
+                <a:pt x="395637" y="769719"/>
               </a:lnTo>
               <a:lnTo>
-                <a:pt x="789417" y="752112"/>
+                <a:pt x="791275" y="769719"/>
               </a:lnTo>
             </a:path>
           </a:pathLst>
@@ -7196,8 +7231,8 @@
         </a:p>
       </dsp:txBody>
       <dsp:txXfrm>
-        <a:off x="1572688" y="3698789"/>
-        <a:ext cx="54517" cy="54517"/>
+        <a:off x="1571420" y="3689646"/>
+        <a:ext cx="55194" cy="55194"/>
       </dsp:txXfrm>
     </dsp:sp>
     <dsp:sp modelId="{0974F44A-136F-4341-B08E-506C72B35331}">
@@ -7207,8 +7242,8 @@
       </dsp:nvSpPr>
       <dsp:spPr>
         <a:xfrm>
-          <a:off x="1205238" y="2597879"/>
-          <a:ext cx="789417" cy="752112"/>
+          <a:off x="1203379" y="2597879"/>
+          <a:ext cx="791275" cy="734505"/>
         </a:xfrm>
         <a:custGeom>
           <a:avLst/>
@@ -7219,16 +7254,16 @@
           <a:pathLst>
             <a:path>
               <a:moveTo>
-                <a:pt x="0" y="752112"/>
+                <a:pt x="0" y="734505"/>
               </a:moveTo>
               <a:lnTo>
-                <a:pt x="394708" y="752112"/>
+                <a:pt x="395637" y="734505"/>
               </a:lnTo>
               <a:lnTo>
-                <a:pt x="394708" y="0"/>
+                <a:pt x="395637" y="0"/>
               </a:lnTo>
               <a:lnTo>
-                <a:pt x="789417" y="0"/>
+                <a:pt x="791275" y="0"/>
               </a:lnTo>
             </a:path>
           </a:pathLst>
@@ -7283,8 +7318,8 @@
         </a:p>
       </dsp:txBody>
       <dsp:txXfrm>
-        <a:off x="1572688" y="2946676"/>
-        <a:ext cx="54517" cy="54517"/>
+        <a:off x="1572026" y="2938140"/>
+        <a:ext cx="53981" cy="53981"/>
       </dsp:txXfrm>
     </dsp:sp>
     <dsp:sp modelId="{CADE9A54-F7C9-4BB4-9F5C-9F4E0FE78E79}">
@@ -7294,8 +7329,8 @@
       </dsp:nvSpPr>
       <dsp:spPr>
         <a:xfrm>
-          <a:off x="1205238" y="1093654"/>
-          <a:ext cx="789417" cy="2256337"/>
+          <a:off x="1203379" y="1093654"/>
+          <a:ext cx="791275" cy="2238729"/>
         </a:xfrm>
         <a:custGeom>
           <a:avLst/>
@@ -7306,16 +7341,16 @@
           <a:pathLst>
             <a:path>
               <a:moveTo>
-                <a:pt x="0" y="2256337"/>
+                <a:pt x="0" y="2238729"/>
               </a:moveTo>
               <a:lnTo>
-                <a:pt x="394708" y="2256337"/>
+                <a:pt x="395637" y="2238729"/>
               </a:lnTo>
               <a:lnTo>
-                <a:pt x="394708" y="0"/>
+                <a:pt x="395637" y="0"/>
               </a:lnTo>
               <a:lnTo>
-                <a:pt x="789417" y="0"/>
+                <a:pt x="791275" y="0"/>
               </a:lnTo>
             </a:path>
           </a:pathLst>
@@ -7370,8 +7405,8 @@
         </a:p>
       </dsp:txBody>
       <dsp:txXfrm>
-        <a:off x="1540185" y="2162061"/>
-        <a:ext cx="119522" cy="119522"/>
+        <a:off x="1539656" y="2153657"/>
+        <a:ext cx="118722" cy="118722"/>
       </dsp:txXfrm>
     </dsp:sp>
     <dsp:sp modelId="{F9761A3D-BD27-4661-BFA2-D015331A3776}">
@@ -7381,7 +7416,7 @@
       </dsp:nvSpPr>
       <dsp:spPr>
         <a:xfrm rot="16200000">
-          <a:off x="-2563240" y="2748301"/>
+          <a:off x="-2565098" y="2730694"/>
           <a:ext cx="6333577" cy="1203379"/>
         </a:xfrm>
         <a:prstGeom prst="rect">
@@ -7421,7 +7456,7 @@
         </a:fontRef>
       </dsp:style>
       <dsp:txBody>
-        <a:bodyPr spcFirstLastPara="0" vert="horz" wrap="square" lIns="8890" tIns="8890" rIns="8890" bIns="8890" numCol="1" spcCol="1270" anchor="ctr" anchorCtr="0">
+        <a:bodyPr spcFirstLastPara="0" vert="vert" wrap="square" lIns="8890" tIns="8890" rIns="8890" bIns="8890" numCol="1" spcCol="1270" anchor="ctr" anchorCtr="0">
           <a:noAutofit/>
         </a:bodyPr>
         <a:lstStyle/>
@@ -7439,7 +7474,7 @@
             <a:buNone/>
           </a:pPr>
           <a:r>
-            <a:rPr lang="en-ZA" sz="1400" b="1" kern="1200">
+            <a:rPr lang="en-ZA" sz="1400" b="1" u="sng" kern="1200">
               <a:latin typeface="Aptos" panose="020B0004020202020204" pitchFamily="34" charset="0"/>
             </a:rPr>
             <a:t>Home</a:t>
@@ -7462,12 +7497,112 @@
             <a:rPr lang="en-ZA" sz="1100" kern="1200">
               <a:latin typeface="Aptos" panose="020B0004020202020204" pitchFamily="34" charset="0"/>
             </a:rPr>
-            <a:t>(Intro)</a:t>
+            <a:t>Header/</a:t>
+          </a:r>
+        </a:p>
+        <a:p>
+          <a:pPr marL="0" lvl="0" indent="0" algn="ctr" defTabSz="622300">
+            <a:lnSpc>
+              <a:spcPct val="90000"/>
+            </a:lnSpc>
+            <a:spcBef>
+              <a:spcPct val="0"/>
+            </a:spcBef>
+            <a:spcAft>
+              <a:spcPct val="35000"/>
+            </a:spcAft>
+            <a:buNone/>
+          </a:pPr>
+          <a:r>
+            <a:rPr lang="en-ZA" sz="1100" kern="1200">
+              <a:latin typeface="Aptos" panose="020B0004020202020204" pitchFamily="34" charset="0"/>
+            </a:rPr>
+            <a:t>Navigation Menue</a:t>
+          </a:r>
+        </a:p>
+        <a:p>
+          <a:pPr marL="0" lvl="0" indent="0" algn="ctr" defTabSz="622300">
+            <a:lnSpc>
+              <a:spcPct val="90000"/>
+            </a:lnSpc>
+            <a:spcBef>
+              <a:spcPct val="0"/>
+            </a:spcBef>
+            <a:spcAft>
+              <a:spcPct val="35000"/>
+            </a:spcAft>
+            <a:buNone/>
+          </a:pPr>
+          <a:r>
+            <a:rPr lang="en-ZA" sz="1100" kern="1200">
+              <a:latin typeface="Aptos" panose="020B0004020202020204" pitchFamily="34" charset="0"/>
+            </a:rPr>
+            <a:t>Intro</a:t>
+          </a:r>
+        </a:p>
+        <a:p>
+          <a:pPr marL="0" lvl="0" indent="0" algn="ctr" defTabSz="622300">
+            <a:lnSpc>
+              <a:spcPct val="90000"/>
+            </a:lnSpc>
+            <a:spcBef>
+              <a:spcPct val="0"/>
+            </a:spcBef>
+            <a:spcAft>
+              <a:spcPct val="35000"/>
+            </a:spcAft>
+            <a:buNone/>
+          </a:pPr>
+          <a:r>
+            <a:rPr lang="en-ZA" sz="1100" kern="1200">
+              <a:latin typeface="Aptos" panose="020B0004020202020204" pitchFamily="34" charset="0"/>
+            </a:rPr>
+            <a:t>Hero Image</a:t>
+          </a:r>
+        </a:p>
+        <a:p>
+          <a:pPr marL="0" lvl="0" indent="0" algn="ctr" defTabSz="622300">
+            <a:lnSpc>
+              <a:spcPct val="90000"/>
+            </a:lnSpc>
+            <a:spcBef>
+              <a:spcPct val="0"/>
+            </a:spcBef>
+            <a:spcAft>
+              <a:spcPct val="35000"/>
+            </a:spcAft>
+            <a:buNone/>
+          </a:pPr>
+          <a:r>
+            <a:rPr lang="en-ZA" sz="1100" kern="1200">
+              <a:latin typeface="Aptos" panose="020B0004020202020204" pitchFamily="34" charset="0"/>
+            </a:rPr>
+            <a:t>Call To Action</a:t>
+          </a:r>
+        </a:p>
+        <a:p>
+          <a:pPr marL="0" lvl="0" indent="0" algn="ctr" defTabSz="622300">
+            <a:lnSpc>
+              <a:spcPct val="90000"/>
+            </a:lnSpc>
+            <a:spcBef>
+              <a:spcPct val="0"/>
+            </a:spcBef>
+            <a:spcAft>
+              <a:spcPct val="35000"/>
+            </a:spcAft>
+            <a:buNone/>
+          </a:pPr>
+          <a:r>
+            <a:rPr lang="en-ZA" sz="1100" kern="1200">
+              <a:latin typeface="Aptos" panose="020B0004020202020204" pitchFamily="34" charset="0"/>
+            </a:rPr>
+            <a:t>Footer</a:t>
           </a:r>
         </a:p>
       </dsp:txBody>
       <dsp:txXfrm>
-        <a:off x="-2563240" y="2748301"/>
+        <a:off x="-2565098" y="2730694"/>
         <a:ext cx="6333577" cy="1203379"/>
       </dsp:txXfrm>
     </dsp:sp>
@@ -7536,7 +7671,7 @@
             <a:buNone/>
           </a:pPr>
           <a:r>
-            <a:rPr lang="en-ZA" sz="1400" b="1" kern="1200"/>
+            <a:rPr lang="en-ZA" sz="1400" b="1" u="sng" kern="1200"/>
             <a:t>About</a:t>
           </a:r>
         </a:p>
@@ -7554,44 +7689,15 @@
             <a:buNone/>
           </a:pPr>
           <a:r>
-            <a:rPr lang="en-ZA" sz="1200" b="0" kern="1200"/>
-            <a:t>Our story</a:t>
+            <a:rPr lang="en-ZA" sz="1200" b="0" u="none" kern="1200">
+              <a:latin typeface="Aptos" panose="020B0004020202020204" pitchFamily="34" charset="0"/>
+            </a:rPr>
+            <a:t>,Organisation's history, mission, vision, team members and footer</a:t>
           </a:r>
-        </a:p>
-        <a:p>
-          <a:pPr marL="0" lvl="0" indent="0" algn="ctr" defTabSz="622300">
-            <a:lnSpc>
-              <a:spcPct val="90000"/>
-            </a:lnSpc>
-            <a:spcBef>
-              <a:spcPct val="0"/>
-            </a:spcBef>
-            <a:spcAft>
-              <a:spcPct val="35000"/>
-            </a:spcAft>
-            <a:buNone/>
-          </a:pPr>
           <a:r>
-            <a:rPr lang="en-ZA" sz="1200" b="0" kern="1200"/>
-            <a:t>The team</a:t>
-          </a:r>
-        </a:p>
-        <a:p>
-          <a:pPr marL="0" lvl="0" indent="0" algn="ctr" defTabSz="622300">
-            <a:lnSpc>
-              <a:spcPct val="90000"/>
-            </a:lnSpc>
-            <a:spcBef>
-              <a:spcPct val="0"/>
-            </a:spcBef>
-            <a:spcAft>
-              <a:spcPct val="35000"/>
-            </a:spcAft>
-            <a:buNone/>
-          </a:pPr>
-          <a:r>
-            <a:rPr lang="en-ZA" sz="1200" b="0" kern="1200"/>
-            <a:t>reviews</a:t>
+            <a:rPr lang="en-ZA" sz="1400" b="1" u="sng" kern="1200"/>
+            <a:t>
+</a:t>
           </a:r>
         </a:p>
       </dsp:txBody>
@@ -7665,7 +7771,7 @@
             <a:buNone/>
           </a:pPr>
           <a:r>
-            <a:rPr lang="en-ZA" sz="1400" b="1" kern="1200">
+            <a:rPr lang="en-ZA" sz="1400" b="1" u="sng" kern="1200">
               <a:latin typeface="Aptos" panose="020B0004020202020204" pitchFamily="34" charset="0"/>
             </a:rPr>
             <a:t>Services</a:t>
@@ -7688,27 +7794,7 @@
             <a:rPr lang="en-ZA" sz="1200" kern="1200">
               <a:latin typeface="Aptos" panose="020B0004020202020204" pitchFamily="34" charset="0"/>
             </a:rPr>
-            <a:t>Offers </a:t>
-          </a:r>
-        </a:p>
-        <a:p>
-          <a:pPr marL="0" lvl="0" indent="0" algn="ctr" defTabSz="622300">
-            <a:lnSpc>
-              <a:spcPct val="90000"/>
-            </a:lnSpc>
-            <a:spcBef>
-              <a:spcPct val="0"/>
-            </a:spcBef>
-            <a:spcAft>
-              <a:spcPct val="35000"/>
-            </a:spcAft>
-            <a:buNone/>
-          </a:pPr>
-          <a:r>
-            <a:rPr lang="en-ZA" sz="1200" kern="1200">
-              <a:latin typeface="Aptos" panose="020B0004020202020204" pitchFamily="34" charset="0"/>
-            </a:rPr>
-            <a:t> Pricing</a:t>
+            <a:t>Offers and Pricing</a:t>
           </a:r>
         </a:p>
       </dsp:txBody>
@@ -7782,7 +7868,7 @@
             <a:buNone/>
           </a:pPr>
           <a:r>
-            <a:rPr lang="en-ZA" sz="1400" b="1" kern="1200">
+            <a:rPr lang="en-ZA" sz="1400" b="1" u="sng" kern="1200">
               <a:latin typeface="Aptos" panose="020B0004020202020204" pitchFamily="34" charset="0"/>
             </a:rPr>
             <a:t>Enquiry</a:t>
@@ -7805,27 +7891,7 @@
             <a:rPr lang="en-ZA" sz="1200" kern="1200">
               <a:latin typeface="Aptos" panose="020B0004020202020204" pitchFamily="34" charset="0"/>
             </a:rPr>
-            <a:t>Form</a:t>
-          </a:r>
-        </a:p>
-        <a:p>
-          <a:pPr marL="0" lvl="0" indent="0" algn="ctr" defTabSz="622300">
-            <a:lnSpc>
-              <a:spcPct val="90000"/>
-            </a:lnSpc>
-            <a:spcBef>
-              <a:spcPct val="0"/>
-            </a:spcBef>
-            <a:spcAft>
-              <a:spcPct val="35000"/>
-            </a:spcAft>
-            <a:buNone/>
-          </a:pPr>
-          <a:r>
-            <a:rPr lang="en-ZA" sz="1200" kern="1200">
-              <a:latin typeface="Aptos" panose="020B0004020202020204" pitchFamily="34" charset="0"/>
-            </a:rPr>
-            <a:t>Based on what clients need</a:t>
+            <a:t>Form for product/service enquines</a:t>
           </a:r>
         </a:p>
       </dsp:txBody>
@@ -7899,12 +7965,12 @@
             <a:buNone/>
           </a:pPr>
           <a:r>
-            <a:rPr lang="en-ZA" sz="1400" b="1" kern="1200">
+            <a:rPr lang="en-ZA" sz="1400" b="1" u="sng" kern="1200">
               <a:latin typeface="Aptos" panose="020B0004020202020204" pitchFamily="34" charset="0"/>
             </a:rPr>
             <a:t>Contact</a:t>
           </a:r>
-          <a:endParaRPr lang="en-ZA" sz="1100" b="0" kern="1200">
+          <a:endParaRPr lang="en-ZA" sz="1100" b="0" u="sng" kern="1200">
             <a:latin typeface="Aptos" panose="020B0004020202020204" pitchFamily="34" charset="0"/>
           </a:endParaRPr>
         </a:p>
@@ -7925,7 +7991,7 @@
             <a:rPr lang="en-ZA" sz="1200" b="0" kern="1200">
               <a:latin typeface="Aptos" panose="020B0004020202020204" pitchFamily="34" charset="0"/>
             </a:rPr>
-            <a:t>Buissnes Detail</a:t>
+            <a:t>Contact information, map</a:t>
           </a:r>
         </a:p>
       </dsp:txBody>

</xml_diff>